<commit_message>
Update Function Psuedocode demo.docx
</commit_message>
<xml_diff>
--- a/Function Psuedocode demo.docx
+++ b/Function Psuedocode demo.docx
@@ -3,6 +3,9 @@
 <w:document xmlns:wpc="http://schemas.microsoft.com/office/word/2010/wordprocessingCanvas" xmlns:cx="http://schemas.microsoft.com/office/drawing/2014/chartex" xmlns:cx1="http://schemas.microsoft.com/office/drawing/2015/9/8/chartex" xmlns:cx2="http://schemas.microsoft.com/office/drawing/2015/10/21/chartex" xmlns:cx3="http://schemas.microsoft.com/office/drawing/2016/5/9/chartex" xmlns:cx4="http://schemas.microsoft.com/office/drawing/2016/5/10/chartex" xmlns:cx5="http://schemas.microsoft.com/office/drawing/2016/5/11/chartex" xmlns:cx6="http://schemas.microsoft.com/office/drawing/2016/5/12/chartex" xmlns:cx7="http://schemas.microsoft.com/office/drawing/2016/5/13/chartex" xmlns:cx8="http://schemas.microsoft.com/office/drawing/2016/5/14/chartex" xmlns:mc="http://schemas.openxmlformats.org/markup-compatibility/2006" xmlns:aink="http://schemas.microsoft.com/office/drawing/2016/ink" xmlns:am3d="http://schemas.microsoft.com/office/drawing/2017/model3d" xmlns:o="urn:schemas-microsoft-com:office:office" xmlns:oel="http://schemas.microsoft.com/office/2019/extlst" xmlns:r="http://schemas.openxmlformats.org/officeDocument/2006/relationships" xmlns:m="http://schemas.openxmlformats.org/officeDocument/2006/math" xmlns:v="urn:schemas-microsoft-com:vml" xmlns:wp14="http://schemas.microsoft.com/office/word/2010/wordprocessingDrawing" xmlns:wp="http://schemas.openxmlformats.org/drawingml/2006/wordprocessingDrawing" xmlns:w10="urn:schemas-microsoft-com:office:word" xmlns:w="http://schemas.openxmlformats.org/wordprocessingml/2006/main" xmlns:w14="http://schemas.microsoft.com/office/word/2010/wordml" xmlns:w15="http://schemas.microsoft.com/office/word/2012/wordml" xmlns:w16cex="http://schemas.microsoft.com/office/word/2018/wordml/cex" xmlns:w16cid="http://schemas.microsoft.com/office/word/2016/wordml/cid" xmlns:w16="http://schemas.microsoft.com/office/word/2018/wordml" xmlns:w16du="http://schemas.microsoft.com/office/word/2023/wordml/word16du" xmlns:w16sdtdh="http://schemas.microsoft.com/office/word/2020/wordml/sdtdatahash" xmlns:w16sdtfl="http://schemas.microsoft.com/office/word/2024/wordml/sdtformatlock" xmlns:w16se="http://schemas.microsoft.com/office/word/2015/wordml/symex" xmlns:wpg="http://schemas.microsoft.com/office/word/2010/wordprocessingGroup" xmlns:wpi="http://schemas.microsoft.com/office/word/2010/wordprocessingInk" xmlns:wne="http://schemas.microsoft.com/office/word/2006/wordml" xmlns:wps="http://schemas.microsoft.com/office/word/2010/wordprocessingShape" mc:Ignorable="w14 w15 w16se w16cid w16 w16cex w16sdtdh w16sdtfl w16du wp14">
   <w:body>
     <w:p>
+      <w:pPr>
+        <w:pStyle w:val="Title"/>
+      </w:pPr>
       <w:r>
         <w:t>Hiring a cat sitter</w:t>
       </w:r>
@@ -208,8 +211,6 @@
     <w:p>
       <w:r>
         <w:tab/>
-      </w:r>
-      <w:r>
         <w:t>$50 per day</w:t>
       </w:r>
     </w:p>
@@ -231,6 +232,7 @@
         <w:ind w:left="720"/>
       </w:pPr>
       <w:r>
+        <w:lastRenderedPageBreak/>
         <w:t xml:space="preserve"> If 2-5 KM, $5 per trip</w:t>
       </w:r>
     </w:p>
@@ -254,8 +256,26 @@
       <w:r>
         <w:t xml:space="preserve"> Tip (input as a percentage on the final total</w:t>
       </w:r>
-    </w:p>
-    <w:p/>
+      <w:r>
+        <w:t>)</w:t>
+      </w:r>
+    </w:p>
+    <w:p>
+      <w:pPr>
+        <w:pStyle w:val="Heading1"/>
+        <w:rPr>
+          <w:b/>
+          <w:bCs/>
+        </w:rPr>
+      </w:pPr>
+      <w:r>
+        <w:rPr>
+          <w:b/>
+          <w:bCs/>
+        </w:rPr>
+        <w:t>Pseudocode Solution</w:t>
+      </w:r>
+    </w:p>
     <w:p>
       <w:r>
         <w:t xml:space="preserve">FUNCTION </w:t>
@@ -348,22 +368,269 @@
       </w:r>
       <w:proofErr w:type="spellEnd"/>
       <w:r>
+        <w:t xml:space="preserve"> + “ is not a positive or 0 value. Try again”</w:t>
+      </w:r>
+    </w:p>
+    <w:p>
+      <w:r>
+        <w:tab/>
+      </w:r>
+      <w:r>
+        <w:tab/>
+        <w:t>ENDIF</w:t>
+      </w:r>
+    </w:p>
+    <w:p>
+      <w:r>
+        <w:tab/>
+        <w:t>UNTIL</w:t>
+      </w:r>
+      <w:r>
+        <w:t xml:space="preserve"> </w:t>
+      </w:r>
+      <w:proofErr w:type="spellStart"/>
+      <w:r>
+        <w:t>inputValue</w:t>
+      </w:r>
+      <w:proofErr w:type="spellEnd"/>
+      <w:r>
+        <w:t xml:space="preserve"> &gt;= 0</w:t>
+      </w:r>
+    </w:p>
+    <w:p>
+      <w:r>
+        <w:tab/>
+        <w:t xml:space="preserve">RETURN </w:t>
+      </w:r>
+      <w:proofErr w:type="spellStart"/>
+      <w:r>
+        <w:t>inputValue</w:t>
+      </w:r>
+      <w:proofErr w:type="spellEnd"/>
+    </w:p>
+    <w:p>
+      <w:r>
+        <w:t>ENDFUNCTION</w:t>
+      </w:r>
+    </w:p>
+    <w:p/>
+    <w:p>
+      <w:r>
+        <w:t xml:space="preserve">FUNCTION </w:t>
+      </w:r>
+      <w:proofErr w:type="spellStart"/>
+      <w:r>
+        <w:t>calculateTotalCost</w:t>
+      </w:r>
+      <w:proofErr w:type="spellEnd"/>
+      <w:r>
+        <w:t xml:space="preserve"> (</w:t>
+      </w:r>
+      <w:proofErr w:type="spellStart"/>
+      <w:r>
+        <w:t>daysGone</w:t>
+      </w:r>
+      <w:proofErr w:type="spellEnd"/>
+      <w:r>
+        <w:t xml:space="preserve">, </w:t>
+      </w:r>
+      <w:proofErr w:type="spellStart"/>
+      <w:r>
+        <w:t>tripDistance</w:t>
+      </w:r>
+      <w:proofErr w:type="spellEnd"/>
+      <w:r>
+        <w:t xml:space="preserve">, </w:t>
+      </w:r>
+      <w:proofErr w:type="spellStart"/>
+      <w:r>
+        <w:t>tipRate</w:t>
+      </w:r>
+      <w:proofErr w:type="spellEnd"/>
+      <w:r>
+        <w:t>)</w:t>
+      </w:r>
+    </w:p>
+    <w:p>
+      <w:r>
+        <w:tab/>
+        <w:t xml:space="preserve">DECLARE </w:t>
+      </w:r>
+      <w:proofErr w:type="spellStart"/>
+      <w:r>
+        <w:t>totalCharge</w:t>
+      </w:r>
+      <w:proofErr w:type="spellEnd"/>
+      <w:r>
+        <w:t xml:space="preserve"> = 0</w:t>
+      </w:r>
+    </w:p>
+    <w:p>
+      <w:r>
+        <w:tab/>
+        <w:t>//calculate the care cost per day</w:t>
+      </w:r>
+    </w:p>
+    <w:p>
+      <w:r>
+        <w:tab/>
+        <w:t xml:space="preserve">SET </w:t>
+      </w:r>
+      <w:proofErr w:type="spellStart"/>
+      <w:r>
+        <w:t>totalCharge</w:t>
+      </w:r>
+      <w:proofErr w:type="spellEnd"/>
+      <w:r>
+        <w:t xml:space="preserve"> = </w:t>
+      </w:r>
+      <w:proofErr w:type="spellStart"/>
+      <w:r>
+        <w:t>totalCharge</w:t>
+      </w:r>
+      <w:proofErr w:type="spellEnd"/>
+      <w:r>
+        <w:t xml:space="preserve"> + (</w:t>
+      </w:r>
+      <w:proofErr w:type="spellStart"/>
+      <w:r>
+        <w:t>daysGone</w:t>
+      </w:r>
+      <w:proofErr w:type="spellEnd"/>
+      <w:r>
+        <w:t xml:space="preserve"> * 50)</w:t>
+      </w:r>
+    </w:p>
+    <w:p>
+      <w:r>
+        <w:tab/>
+        <w:t>//calculate the travel cost</w:t>
+      </w:r>
+    </w:p>
+    <w:p>
+      <w:r>
+        <w:tab/>
+        <w:t>//Can a module call another module: YES</w:t>
+      </w:r>
+    </w:p>
+    <w:p>
+      <w:r>
+        <w:tab/>
+        <w:t xml:space="preserve">SET </w:t>
+      </w:r>
+      <w:proofErr w:type="spellStart"/>
+      <w:r>
+        <w:t>totalCharge</w:t>
+      </w:r>
+      <w:proofErr w:type="spellEnd"/>
+      <w:r>
+        <w:t xml:space="preserve"> = </w:t>
+      </w:r>
+      <w:proofErr w:type="spellStart"/>
+      <w:r>
+        <w:t>totalCharge</w:t>
+      </w:r>
+      <w:proofErr w:type="spellEnd"/>
+      <w:r>
         <w:t xml:space="preserve"> + </w:t>
       </w:r>
-      <w:proofErr w:type="gramStart"/>
-      <w:r>
-        <w:t>“ is</w:t>
-      </w:r>
-      <w:proofErr w:type="gramEnd"/>
-      <w:r>
-        <w:t xml:space="preserve"> not a positive or 0 value. Try again”</w:t>
-      </w:r>
-    </w:p>
-    <w:p>
-      <w:r>
-        <w:tab/>
-      </w:r>
-      <w:r>
+      <w:proofErr w:type="spellStart"/>
+      <w:r>
+        <w:t>travelCost</w:t>
+      </w:r>
+      <w:proofErr w:type="spellEnd"/>
+      <w:r>
+        <w:t>(</w:t>
+      </w:r>
+      <w:proofErr w:type="spellStart"/>
+      <w:r>
+        <w:t>daysGone</w:t>
+      </w:r>
+      <w:proofErr w:type="spellEnd"/>
+      <w:r>
+        <w:t xml:space="preserve">, </w:t>
+      </w:r>
+      <w:proofErr w:type="spellStart"/>
+      <w:r>
+        <w:t>tripDistance</w:t>
+      </w:r>
+      <w:proofErr w:type="spellEnd"/>
+      <w:r>
+        <w:t>)</w:t>
+      </w:r>
+    </w:p>
+    <w:p>
+      <w:r>
+        <w:tab/>
+        <w:t>//calculate the tip</w:t>
+      </w:r>
+    </w:p>
+    <w:p>
+      <w:r>
+        <w:tab/>
+        <w:t xml:space="preserve">If </w:t>
+      </w:r>
+      <w:proofErr w:type="spellStart"/>
+      <w:r>
+        <w:t>tipRate</w:t>
+      </w:r>
+      <w:proofErr w:type="spellEnd"/>
+      <w:r>
+        <w:t xml:space="preserve"> &gt; 0 THEN</w:t>
+      </w:r>
+    </w:p>
+    <w:p>
+      <w:r>
+        <w:tab/>
+      </w:r>
+      <w:r>
+        <w:tab/>
+        <w:t xml:space="preserve">SET </w:t>
+      </w:r>
+      <w:proofErr w:type="spellStart"/>
+      <w:r>
+        <w:t>totalCharge</w:t>
+      </w:r>
+      <w:proofErr w:type="spellEnd"/>
+      <w:r>
+        <w:t xml:space="preserve"> = </w:t>
+      </w:r>
+      <w:proofErr w:type="spellStart"/>
+      <w:r>
+        <w:t>totalCharge</w:t>
+      </w:r>
+      <w:proofErr w:type="spellEnd"/>
+      <w:r>
+        <w:t xml:space="preserve"> + </w:t>
+      </w:r>
+      <w:proofErr w:type="spellStart"/>
+      <w:r>
+        <w:t>calculateTip</w:t>
+      </w:r>
+      <w:proofErr w:type="spellEnd"/>
+      <w:r>
+        <w:t>(</w:t>
+      </w:r>
+      <w:proofErr w:type="spellStart"/>
+      <w:r>
+        <w:t>totalCharge</w:t>
+      </w:r>
+      <w:proofErr w:type="spellEnd"/>
+      <w:r>
+        <w:t xml:space="preserve">, </w:t>
+      </w:r>
+      <w:proofErr w:type="spellStart"/>
+      <w:r>
+        <w:t>tipRate</w:t>
+      </w:r>
+      <w:proofErr w:type="spellEnd"/>
+      <w:r>
+        <w:t>)</w:t>
+      </w:r>
+    </w:p>
+    <w:p>
+      <w:r>
+        <w:lastRenderedPageBreak/>
         <w:tab/>
         <w:t>ENDIF</w:t>
       </w:r>
@@ -371,29 +638,20 @@
     <w:p>
       <w:r>
         <w:tab/>
-      </w:r>
-      <w:proofErr w:type="gramStart"/>
-      <w:r>
-        <w:t>UNTIL(</w:t>
-      </w:r>
-      <w:proofErr w:type="spellStart"/>
-      <w:proofErr w:type="gramEnd"/>
-      <w:r>
-        <w:t>inputValue</w:t>
-      </w:r>
-      <w:proofErr w:type="spellEnd"/>
-      <w:r>
-        <w:t xml:space="preserve"> &gt;= 0)</w:t>
-      </w:r>
-    </w:p>
-    <w:p>
-      <w:r>
-        <w:tab/>
-        <w:t xml:space="preserve">RETURN </w:t>
-      </w:r>
-      <w:proofErr w:type="spellStart"/>
-      <w:r>
-        <w:t>inputValue</w:t>
+        <w:t>//result the total cost</w:t>
+      </w:r>
+    </w:p>
+    <w:p>
+      <w:r>
+        <w:tab/>
+        <w:t>RETURN</w:t>
+      </w:r>
+      <w:r>
+        <w:t xml:space="preserve"> </w:t>
+      </w:r>
+      <w:proofErr w:type="spellStart"/>
+      <w:r>
+        <w:t>totalCharge</w:t>
       </w:r>
       <w:proofErr w:type="spellEnd"/>
     </w:p>
@@ -408,13 +666,439 @@
       </w:r>
       <w:proofErr w:type="spellStart"/>
       <w:r>
+        <w:t>travelCost</w:t>
+      </w:r>
+      <w:proofErr w:type="spellEnd"/>
+      <w:r>
+        <w:t>(</w:t>
+      </w:r>
+      <w:proofErr w:type="spellStart"/>
+      <w:r>
+        <w:t>daysGone</w:t>
+      </w:r>
+      <w:proofErr w:type="spellEnd"/>
+      <w:r>
+        <w:t xml:space="preserve">, </w:t>
+      </w:r>
+      <w:proofErr w:type="spellStart"/>
+      <w:r>
+        <w:t>tripDistance</w:t>
+      </w:r>
+      <w:proofErr w:type="spellEnd"/>
+      <w:r>
+        <w:t>)</w:t>
+      </w:r>
+    </w:p>
+    <w:p>
+      <w:r>
+        <w:tab/>
+      </w:r>
+      <w:r>
+        <w:t xml:space="preserve">DECLARE </w:t>
+      </w:r>
+      <w:proofErr w:type="spellStart"/>
+      <w:r>
+        <w:t>tripCost</w:t>
+      </w:r>
+      <w:proofErr w:type="spellEnd"/>
+      <w:r>
+        <w:t xml:space="preserve"> = 0</w:t>
+      </w:r>
+    </w:p>
+    <w:p>
+      <w:r>
+        <w:tab/>
+        <w:t xml:space="preserve">IF </w:t>
+      </w:r>
+      <w:proofErr w:type="spellStart"/>
+      <w:r>
+        <w:t>tripDistance</w:t>
+      </w:r>
+      <w:proofErr w:type="spellEnd"/>
+      <w:r>
+        <w:t xml:space="preserve"> &gt; 10 THEN</w:t>
+      </w:r>
+    </w:p>
+    <w:p>
+      <w:r>
+        <w:tab/>
+      </w:r>
+      <w:r>
+        <w:tab/>
+      </w:r>
+      <w:proofErr w:type="spellStart"/>
+      <w:r>
+        <w:t>tripCost</w:t>
+      </w:r>
+      <w:proofErr w:type="spellEnd"/>
+      <w:r>
+        <w:t xml:space="preserve"> </w:t>
+      </w:r>
+      <w:r>
+        <w:t>= 15</w:t>
+      </w:r>
+    </w:p>
+    <w:p>
+      <w:r>
+        <w:tab/>
+        <w:t xml:space="preserve">ELSEIF </w:t>
+      </w:r>
+      <w:proofErr w:type="spellStart"/>
+      <w:r>
+        <w:t>tripDistance</w:t>
+      </w:r>
+      <w:proofErr w:type="spellEnd"/>
+      <w:r>
+        <w:t xml:space="preserve"> &gt;</w:t>
+      </w:r>
+      <w:r>
+        <w:t>=</w:t>
+      </w:r>
+      <w:r>
+        <w:t xml:space="preserve"> </w:t>
+      </w:r>
+      <w:r>
+        <w:t>5</w:t>
+      </w:r>
+      <w:r>
+        <w:t xml:space="preserve"> THEN</w:t>
+      </w:r>
+    </w:p>
+    <w:p>
+      <w:r>
+        <w:tab/>
+      </w:r>
+      <w:r>
+        <w:tab/>
+      </w:r>
+      <w:proofErr w:type="spellStart"/>
+      <w:r>
+        <w:t>tripCost</w:t>
+      </w:r>
+      <w:proofErr w:type="spellEnd"/>
+      <w:r>
+        <w:t xml:space="preserve"> = 1</w:t>
+      </w:r>
+      <w:r>
+        <w:t>0</w:t>
+      </w:r>
+    </w:p>
+    <w:p>
+      <w:r>
+        <w:tab/>
+        <w:t xml:space="preserve">ELSEIF </w:t>
+      </w:r>
+      <w:proofErr w:type="spellStart"/>
+      <w:r>
+        <w:t>tripDistance</w:t>
+      </w:r>
+      <w:proofErr w:type="spellEnd"/>
+      <w:r>
+        <w:t xml:space="preserve"> &gt;</w:t>
+      </w:r>
+      <w:r>
+        <w:t>=</w:t>
+      </w:r>
+      <w:r>
+        <w:t xml:space="preserve"> </w:t>
+      </w:r>
+      <w:r>
+        <w:t>2</w:t>
+      </w:r>
+      <w:r>
+        <w:t xml:space="preserve"> THEN</w:t>
+      </w:r>
+    </w:p>
+    <w:p>
+      <w:r>
+        <w:tab/>
+      </w:r>
+      <w:r>
+        <w:tab/>
+      </w:r>
+      <w:proofErr w:type="spellStart"/>
+      <w:r>
+        <w:t>tripCost</w:t>
+      </w:r>
+      <w:proofErr w:type="spellEnd"/>
+      <w:r>
+        <w:t xml:space="preserve"> = 5</w:t>
+      </w:r>
+    </w:p>
+    <w:p>
+      <w:r>
+        <w:tab/>
+        <w:t>ELSE</w:t>
+      </w:r>
+    </w:p>
+    <w:p>
+      <w:r>
+        <w:tab/>
+      </w:r>
+      <w:r>
+        <w:tab/>
+      </w:r>
+      <w:proofErr w:type="spellStart"/>
+      <w:r>
+        <w:t>tripCost</w:t>
+      </w:r>
+      <w:proofErr w:type="spellEnd"/>
+      <w:r>
+        <w:t xml:space="preserve"> </w:t>
+      </w:r>
+      <w:r>
+        <w:t>= 0</w:t>
+      </w:r>
+    </w:p>
+    <w:p>
+      <w:r>
+        <w:tab/>
+        <w:t xml:space="preserve">ENDIF </w:t>
+      </w:r>
+    </w:p>
+    <w:p>
+      <w:r>
+        <w:tab/>
+        <w:t>//calculate and return the total travel cost</w:t>
+      </w:r>
+    </w:p>
+    <w:p>
+      <w:r>
+        <w:tab/>
+        <w:t>RETURN</w:t>
+      </w:r>
+      <w:r>
+        <w:t xml:space="preserve">  </w:t>
+      </w:r>
+      <w:proofErr w:type="spellStart"/>
+      <w:r>
+        <w:t>tripCost</w:t>
+      </w:r>
+      <w:proofErr w:type="spellEnd"/>
+      <w:r>
+        <w:t xml:space="preserve"> * </w:t>
+      </w:r>
+      <w:proofErr w:type="spellStart"/>
+      <w:r>
+        <w:t>daysGone</w:t>
+      </w:r>
+      <w:proofErr w:type="spellEnd"/>
+    </w:p>
+    <w:p>
+      <w:r>
+        <w:t>ENDFUNCTION</w:t>
+      </w:r>
+    </w:p>
+    <w:p>
+      <w:r>
+        <w:t xml:space="preserve">FUNCTION </w:t>
+      </w:r>
+      <w:proofErr w:type="spellStart"/>
+      <w:r>
+        <w:t>calculateTip</w:t>
+      </w:r>
+      <w:proofErr w:type="spellEnd"/>
+      <w:r>
+        <w:t>(</w:t>
+      </w:r>
+      <w:proofErr w:type="spellStart"/>
+      <w:r>
+        <w:t>totalCharge</w:t>
+      </w:r>
+      <w:proofErr w:type="spellEnd"/>
+      <w:r>
+        <w:t xml:space="preserve">, </w:t>
+      </w:r>
+      <w:proofErr w:type="spellStart"/>
+      <w:r>
+        <w:t>tipRate</w:t>
+      </w:r>
+      <w:proofErr w:type="spellEnd"/>
+      <w:r>
+        <w:t>)</w:t>
+      </w:r>
+    </w:p>
+    <w:p>
+      <w:r>
+        <w:tab/>
+        <w:t>//</w:t>
+      </w:r>
+      <w:proofErr w:type="spellStart"/>
+      <w:r>
+        <w:t>tipRate</w:t>
+      </w:r>
+      <w:proofErr w:type="spellEnd"/>
+      <w:r>
+        <w:t xml:space="preserve"> is sent as a whole number which needs to be converted to a percentage</w:t>
+      </w:r>
+    </w:p>
+    <w:p>
+      <w:r>
+        <w:tab/>
+        <w:t>RETURN</w:t>
+      </w:r>
+      <w:r>
+        <w:t xml:space="preserve"> </w:t>
+      </w:r>
+      <w:proofErr w:type="spellStart"/>
+      <w:r>
+        <w:t>totalCharge</w:t>
+      </w:r>
+      <w:proofErr w:type="spellEnd"/>
+      <w:r>
+        <w:t xml:space="preserve"> * (</w:t>
+      </w:r>
+      <w:proofErr w:type="spellStart"/>
+      <w:r>
+        <w:t>tipRate</w:t>
+      </w:r>
+      <w:proofErr w:type="spellEnd"/>
+      <w:r>
+        <w:t xml:space="preserve"> / 100)</w:t>
+      </w:r>
+    </w:p>
+    <w:p>
+      <w:r>
+        <w:t>ENDFUNCTION</w:t>
+      </w:r>
+    </w:p>
+    <w:p/>
+    <w:p>
+      <w:r>
+        <w:t>START</w:t>
+      </w:r>
+    </w:p>
+    <w:p>
+      <w:r>
+        <w:t xml:space="preserve">DECLARE </w:t>
+      </w:r>
+      <w:proofErr w:type="spellStart"/>
+      <w:r>
+        <w:t>totalCost</w:t>
+      </w:r>
+      <w:proofErr w:type="spellEnd"/>
+    </w:p>
+    <w:p>
+      <w:r>
+        <w:t xml:space="preserve">DECLARE </w:t>
+      </w:r>
+      <w:proofErr w:type="spellStart"/>
+      <w:r>
+        <w:t>daysGone</w:t>
+      </w:r>
+      <w:proofErr w:type="spellEnd"/>
+    </w:p>
+    <w:p>
+      <w:r>
+        <w:t xml:space="preserve">DECLARE </w:t>
+      </w:r>
+      <w:proofErr w:type="spellStart"/>
+      <w:r>
+        <w:t>tripDistance</w:t>
+      </w:r>
+      <w:proofErr w:type="spellEnd"/>
+    </w:p>
+    <w:p>
+      <w:r>
+        <w:t xml:space="preserve">DELCARE </w:t>
+      </w:r>
+      <w:proofErr w:type="spellStart"/>
+      <w:r>
+        <w:t>tipRateAsPercentage</w:t>
+      </w:r>
+      <w:proofErr w:type="spellEnd"/>
+    </w:p>
+    <w:p>
+      <w:r>
+        <w:t xml:space="preserve">SET </w:t>
+      </w:r>
+      <w:proofErr w:type="spellStart"/>
+      <w:r>
+        <w:t>daysGone</w:t>
+      </w:r>
+      <w:proofErr w:type="spellEnd"/>
+      <w:r>
+        <w:t xml:space="preserve"> = </w:t>
+      </w:r>
+      <w:proofErr w:type="spellStart"/>
+      <w:r>
+        <w:t>getNumber</w:t>
+      </w:r>
+      <w:proofErr w:type="spellEnd"/>
+      <w:r>
+        <w:t>(“Enter the number of days gone”)</w:t>
+      </w:r>
+    </w:p>
+    <w:p>
+      <w:r>
+        <w:lastRenderedPageBreak/>
+        <w:t xml:space="preserve">SET </w:t>
+      </w:r>
+      <w:proofErr w:type="spellStart"/>
+      <w:r>
+        <w:t>tripDistance</w:t>
+      </w:r>
+      <w:proofErr w:type="spellEnd"/>
+      <w:r>
+        <w:t xml:space="preserve"> = </w:t>
+      </w:r>
+      <w:proofErr w:type="spellStart"/>
+      <w:r>
+        <w:t>getNumber</w:t>
+      </w:r>
+      <w:proofErr w:type="spellEnd"/>
+      <w:r>
+        <w:t>(“Enter the trip distance (distance travel between houses)”)</w:t>
+      </w:r>
+    </w:p>
+    <w:p>
+      <w:r>
+        <w:t xml:space="preserve">SET </w:t>
+      </w:r>
+      <w:proofErr w:type="spellStart"/>
+      <w:r>
+        <w:t>tipRate</w:t>
+      </w:r>
+      <w:proofErr w:type="spellEnd"/>
+      <w:r>
+        <w:t xml:space="preserve"> = </w:t>
+      </w:r>
+      <w:proofErr w:type="spellStart"/>
+      <w:r>
+        <w:t>getNumber</w:t>
+      </w:r>
+      <w:proofErr w:type="spellEnd"/>
+      <w:r>
+        <w:t>(“Enter tip rate</w:t>
+      </w:r>
+      <w:r>
+        <w:t xml:space="preserve"> (</w:t>
+      </w:r>
+      <w:r>
+        <w:t>EX: enter 10 for 10%)</w:t>
+      </w:r>
+      <w:r>
+        <w:t>”)</w:t>
+      </w:r>
+    </w:p>
+    <w:p>
+      <w:r>
+        <w:t xml:space="preserve">SET </w:t>
+      </w:r>
+      <w:proofErr w:type="spellStart"/>
+      <w:r>
+        <w:t>totalCost</w:t>
+      </w:r>
+      <w:proofErr w:type="spellEnd"/>
+      <w:r>
+        <w:t xml:space="preserve"> = </w:t>
+      </w:r>
+      <w:proofErr w:type="spellStart"/>
+      <w:r>
         <w:t>calculateTotalCost</w:t>
       </w:r>
       <w:proofErr w:type="spellEnd"/>
       <w:r>
-        <w:t xml:space="preserve"> </w:t>
-      </w:r>
-      <w:r>
         <w:t>(</w:t>
       </w:r>
       <w:proofErr w:type="spellStart"/>
@@ -444,198 +1128,7 @@
     </w:p>
     <w:p>
       <w:r>
-        <w:tab/>
-        <w:t>RETURN</w:t>
-      </w:r>
-    </w:p>
-    <w:p>
-      <w:r>
-        <w:t>ENDFUNCTION</w:t>
-      </w:r>
-    </w:p>
-    <w:p/>
-    <w:p/>
-    <w:p>
-      <w:r>
-        <w:t>START</w:t>
-      </w:r>
-    </w:p>
-    <w:p>
-      <w:r>
-        <w:t xml:space="preserve">DECLARE </w:t>
-      </w:r>
-      <w:proofErr w:type="spellStart"/>
-      <w:r>
-        <w:t>totalCost</w:t>
-      </w:r>
-      <w:proofErr w:type="spellEnd"/>
-    </w:p>
-    <w:p>
-      <w:r>
-        <w:t xml:space="preserve">DECLARE </w:t>
-      </w:r>
-      <w:proofErr w:type="spellStart"/>
-      <w:r>
-        <w:t>daysGone</w:t>
-      </w:r>
-      <w:proofErr w:type="spellEnd"/>
-    </w:p>
-    <w:p>
-      <w:r>
-        <w:t xml:space="preserve">DECLARE </w:t>
-      </w:r>
-      <w:proofErr w:type="spellStart"/>
-      <w:r>
-        <w:t>tripDistance</w:t>
-      </w:r>
-      <w:proofErr w:type="spellEnd"/>
-    </w:p>
-    <w:p>
-      <w:r>
-        <w:t xml:space="preserve">DELCARE </w:t>
-      </w:r>
-      <w:proofErr w:type="spellStart"/>
-      <w:r>
-        <w:t>tipRateAsPercentage</w:t>
-      </w:r>
-      <w:proofErr w:type="spellEnd"/>
-    </w:p>
-    <w:p>
-      <w:r>
-        <w:t xml:space="preserve">SET </w:t>
-      </w:r>
-      <w:proofErr w:type="spellStart"/>
-      <w:r>
-        <w:t>daysGone</w:t>
-      </w:r>
-      <w:proofErr w:type="spellEnd"/>
-      <w:r>
-        <w:t xml:space="preserve"> = </w:t>
-      </w:r>
-      <w:proofErr w:type="spellStart"/>
-      <w:proofErr w:type="gramStart"/>
-      <w:r>
-        <w:t>getNumber</w:t>
-      </w:r>
-      <w:proofErr w:type="spellEnd"/>
-      <w:r>
-        <w:t>(</w:t>
-      </w:r>
-      <w:proofErr w:type="gramEnd"/>
-      <w:r>
-        <w:t>“Enter the number of days gone”)</w:t>
-      </w:r>
-    </w:p>
-    <w:p>
-      <w:r>
-        <w:t xml:space="preserve">SET </w:t>
-      </w:r>
-      <w:proofErr w:type="spellStart"/>
-      <w:r>
-        <w:t>tripDistance</w:t>
-      </w:r>
-      <w:proofErr w:type="spellEnd"/>
-      <w:r>
-        <w:t xml:space="preserve"> = </w:t>
-      </w:r>
-      <w:proofErr w:type="spellStart"/>
-      <w:proofErr w:type="gramStart"/>
-      <w:r>
-        <w:t>getNumber</w:t>
-      </w:r>
-      <w:proofErr w:type="spellEnd"/>
-      <w:r>
-        <w:t>(</w:t>
-      </w:r>
-      <w:proofErr w:type="gramEnd"/>
-      <w:r>
-        <w:t>“Enter the trip distance (distance travel between houses)”)</w:t>
-      </w:r>
-    </w:p>
-    <w:p>
-      <w:r>
-        <w:t xml:space="preserve">SET </w:t>
-      </w:r>
-      <w:proofErr w:type="spellStart"/>
-      <w:r>
-        <w:t>tipRate</w:t>
-      </w:r>
-      <w:proofErr w:type="spellEnd"/>
-      <w:r>
-        <w:t xml:space="preserve"> = </w:t>
-      </w:r>
-      <w:proofErr w:type="spellStart"/>
-      <w:proofErr w:type="gramStart"/>
-      <w:r>
-        <w:t>getNumber</w:t>
-      </w:r>
-      <w:proofErr w:type="spellEnd"/>
-      <w:r>
-        <w:t>(</w:t>
-      </w:r>
-      <w:proofErr w:type="gramEnd"/>
-      <w:r>
-        <w:t>“Enter tip rate”)</w:t>
-      </w:r>
-    </w:p>
-    <w:p>
-      <w:r>
-        <w:t xml:space="preserve">SET </w:t>
-      </w:r>
-      <w:proofErr w:type="spellStart"/>
-      <w:r>
-        <w:t>totalCost</w:t>
-      </w:r>
-      <w:proofErr w:type="spellEnd"/>
-      <w:r>
-        <w:t xml:space="preserve"> = </w:t>
-      </w:r>
-      <w:proofErr w:type="spellStart"/>
-      <w:proofErr w:type="gramStart"/>
-      <w:r>
-        <w:t>calculateTotalCost</w:t>
-      </w:r>
-      <w:proofErr w:type="spellEnd"/>
-      <w:r>
-        <w:t>(</w:t>
-      </w:r>
-      <w:proofErr w:type="spellStart"/>
-      <w:proofErr w:type="gramEnd"/>
-      <w:r>
-        <w:t>daysGone</w:t>
-      </w:r>
-      <w:proofErr w:type="spellEnd"/>
-      <w:r>
-        <w:t xml:space="preserve">, </w:t>
-      </w:r>
-      <w:proofErr w:type="spellStart"/>
-      <w:r>
-        <w:t>tripDistance</w:t>
-      </w:r>
-      <w:proofErr w:type="spellEnd"/>
-      <w:r>
-        <w:t xml:space="preserve">, </w:t>
-      </w:r>
-      <w:proofErr w:type="spellStart"/>
-      <w:r>
-        <w:t>tipRate</w:t>
-      </w:r>
-      <w:proofErr w:type="spellEnd"/>
-      <w:r>
-        <w:t>)</w:t>
-      </w:r>
-    </w:p>
-    <w:p>
-      <w:r>
-        <w:t xml:space="preserve">PRINT “The total cost of caring for your pets is </w:t>
-      </w:r>
-      <w:proofErr w:type="gramStart"/>
-      <w:r>
-        <w:t>$“ +</w:t>
-      </w:r>
-      <w:proofErr w:type="gramEnd"/>
-      <w:r>
-        <w:t xml:space="preserve"> </w:t>
+        <w:t xml:space="preserve">PRINT “The total cost of caring for your pets is $“ + </w:t>
       </w:r>
       <w:proofErr w:type="spellStart"/>
       <w:r>

</xml_diff>